<commit_message>
Kamchatka deck: add the student's name to the title slide and speech
Co-Authored-By: Claude Opus 5.5 <noreply@anthropic.com>
Claude-Session: https://claude.ai/code/session_016zrvTGhVNwvaX5P5wAX8tW
</commit_message>
<xml_diff>
--- a/presentations/kamchatka/Вулканы_Камчатки_текст_доклада.docx
+++ b/presentations/kamchatka/Вулканы_Камчатки_текст_доклада.docx
@@ -8,6 +8,11 @@
       </w:pPr>
       <w:r>
         <w:t>Вулканы Камчатки — текст доклада</w:t>
+      </w:r>
+    </w:p>
+    <w:p>
+      <w:r>
+        <w:t>Доклад ученика 8А класса Серазентдинова Артура</w:t>
       </w:r>
     </w:p>
     <w:p>
@@ -326,7 +331,7 @@
     </w:p>
     <w:p>
       <w:r>
-        <w:t>Спасибо за внимание! Готов(а) ответить на ваши вопросы.</w:t>
+        <w:t>Спасибо за внимание! Готов ответить на ваши вопросы.</w:t>
       </w:r>
     </w:p>
     <w:sectPr>

</xml_diff>